<commit_message>
Update grant application templates (with budget description requirement)
</commit_message>
<xml_diff>
--- a/assets/docs/cost-grant-applications-templates/ITCG-application-template.docx
+++ b/assets/docs/cost-grant-applications-templates/ITCG-application-template.docx
@@ -1,6 +1,6 @@
 
 <file path=word/document.xml><?xml version="1.0" encoding="utf-8"?>
-<w:document xmlns:wpc="http://schemas.microsoft.com/office/word/2010/wordprocessingCanvas" xmlns:cx="http://schemas.microsoft.com/office/drawing/2014/chartex" xmlns:cx1="http://schemas.microsoft.com/office/drawing/2015/9/8/chartex" xmlns:cx2="http://schemas.microsoft.com/office/drawing/2015/10/21/chartex" xmlns:cx3="http://schemas.microsoft.com/office/drawing/2016/5/9/chartex" xmlns:cx4="http://schemas.microsoft.com/office/drawing/2016/5/10/chartex" xmlns:cx5="http://schemas.microsoft.com/office/drawing/2016/5/11/chartex" xmlns:cx6="http://schemas.microsoft.com/office/drawing/2016/5/12/chartex" xmlns:cx7="http://schemas.microsoft.com/office/drawing/2016/5/13/chartex" xmlns:cx8="http://schemas.microsoft.com/office/drawing/2016/5/14/chartex" xmlns:mc="http://schemas.openxmlformats.org/markup-compatibility/2006" xmlns:aink="http://schemas.microsoft.com/office/drawing/2016/ink" xmlns:am3d="http://schemas.microsoft.com/office/drawing/2017/model3d" xmlns:o="urn:schemas-microsoft-com:office:office" xmlns:oel="http://schemas.microsoft.com/office/2019/extlst" xmlns:r="http://schemas.openxmlformats.org/officeDocument/2006/relationships" xmlns:m="http://schemas.openxmlformats.org/officeDocument/2006/math" xmlns:v="urn:schemas-microsoft-com:vml" xmlns:wp14="http://schemas.microsoft.com/office/word/2010/wordprocessingDrawing" xmlns:wp="http://schemas.openxmlformats.org/drawingml/2006/wordprocessingDrawing" xmlns:w10="urn:schemas-microsoft-com:office:word" xmlns:w="http://schemas.openxmlformats.org/wordprocessingml/2006/main" xmlns:w14="http://schemas.microsoft.com/office/word/2010/wordml" xmlns:w15="http://schemas.microsoft.com/office/word/2012/wordml" xmlns:w16cex="http://schemas.microsoft.com/office/word/2018/wordml/cex" xmlns:w16cid="http://schemas.microsoft.com/office/word/2016/wordml/cid" xmlns:w16="http://schemas.microsoft.com/office/word/2018/wordml" xmlns:w16du="http://schemas.microsoft.com/office/word/2023/wordml/word16du" xmlns:w16sdtdh="http://schemas.microsoft.com/office/word/2020/wordml/sdtdatahash" xmlns:w16se="http://schemas.microsoft.com/office/word/2015/wordml/symex" xmlns:wpg="http://schemas.microsoft.com/office/word/2010/wordprocessingGroup" xmlns:wpi="http://schemas.microsoft.com/office/word/2010/wordprocessingInk" xmlns:wne="http://schemas.microsoft.com/office/word/2006/wordml" xmlns:wps="http://schemas.microsoft.com/office/word/2010/wordprocessingShape" mc:Ignorable="w14 w15 w16se w16cid w16 w16cex w16sdtdh w16du wp14">
+<w:document xmlns:wpc="http://schemas.microsoft.com/office/word/2010/wordprocessingCanvas" xmlns:cx="http://schemas.microsoft.com/office/drawing/2014/chartex" xmlns:cx1="http://schemas.microsoft.com/office/drawing/2015/9/8/chartex" xmlns:cx2="http://schemas.microsoft.com/office/drawing/2015/10/21/chartex" xmlns:cx3="http://schemas.microsoft.com/office/drawing/2016/5/9/chartex" xmlns:cx4="http://schemas.microsoft.com/office/drawing/2016/5/10/chartex" xmlns:cx5="http://schemas.microsoft.com/office/drawing/2016/5/11/chartex" xmlns:cx6="http://schemas.microsoft.com/office/drawing/2016/5/12/chartex" xmlns:cx7="http://schemas.microsoft.com/office/drawing/2016/5/13/chartex" xmlns:cx8="http://schemas.microsoft.com/office/drawing/2016/5/14/chartex" xmlns:mc="http://schemas.openxmlformats.org/markup-compatibility/2006" xmlns:aink="http://schemas.microsoft.com/office/drawing/2016/ink" xmlns:am3d="http://schemas.microsoft.com/office/drawing/2017/model3d" xmlns:o="urn:schemas-microsoft-com:office:office" xmlns:oel="http://schemas.microsoft.com/office/2019/extlst" xmlns:r="http://schemas.openxmlformats.org/officeDocument/2006/relationships" xmlns:m="http://schemas.openxmlformats.org/officeDocument/2006/math" xmlns:v="urn:schemas-microsoft-com:vml" xmlns:wp14="http://schemas.microsoft.com/office/word/2010/wordprocessingDrawing" xmlns:wp="http://schemas.openxmlformats.org/drawingml/2006/wordprocessingDrawing" xmlns:w10="urn:schemas-microsoft-com:office:word" xmlns:w="http://schemas.openxmlformats.org/wordprocessingml/2006/main" xmlns:w14="http://schemas.microsoft.com/office/word/2010/wordml" xmlns:w15="http://schemas.microsoft.com/office/word/2012/wordml" xmlns:w16cex="http://schemas.microsoft.com/office/word/2018/wordml/cex" xmlns:w16cid="http://schemas.microsoft.com/office/word/2016/wordml/cid" xmlns:w16="http://schemas.microsoft.com/office/word/2018/wordml" xmlns:w16du="http://schemas.microsoft.com/office/word/2023/wordml/word16du" xmlns:w16sdtdh="http://schemas.microsoft.com/office/word/2020/wordml/sdtdatahash" xmlns:w16sdtfl="http://schemas.microsoft.com/office/word/2024/wordml/sdtformatlock" xmlns:w16se="http://schemas.microsoft.com/office/word/2015/wordml/symex" xmlns:wpg="http://schemas.microsoft.com/office/word/2010/wordprocessingGroup" xmlns:wpi="http://schemas.microsoft.com/office/word/2010/wordprocessingInk" xmlns:wne="http://schemas.microsoft.com/office/word/2006/wordml" xmlns:wps="http://schemas.microsoft.com/office/word/2010/wordprocessingShape" mc:Ignorable="w14 w15 w16se w16cid w16 w16cex w16sdtdh w16sdtfl w16du wp14">
   <w:body>
     <w:p>
       <w:pPr>
@@ -231,7 +231,23 @@
                 <w:rFonts w:ascii="ArialMT" w:hAnsi="ArialMT" w:cs="ArialMT"/>
                 <w:color w:val="656966"/>
               </w:rPr>
-              <w:t xml:space="preserve">Conference web-page: </w:t>
+              <w:t xml:space="preserve">Conference </w:t>
+            </w:r>
+            <w:proofErr w:type="gramStart"/>
+            <w:r>
+              <w:rPr>
+                <w:rFonts w:ascii="ArialMT" w:hAnsi="ArialMT" w:cs="ArialMT"/>
+                <w:color w:val="656966"/>
+              </w:rPr>
+              <w:t>web-page</w:t>
+            </w:r>
+            <w:proofErr w:type="gramEnd"/>
+            <w:r>
+              <w:rPr>
+                <w:rFonts w:ascii="ArialMT" w:hAnsi="ArialMT" w:cs="ArialMT"/>
+                <w:color w:val="656966"/>
+              </w:rPr>
+              <w:t xml:space="preserve">: </w:t>
             </w:r>
           </w:p>
           <w:p>
@@ -521,13 +537,27 @@
               <w:rPr>
                 <w:shd w:val="clear" w:color="auto" w:fill="C5C5BD" w:themeFill="background2"/>
               </w:rPr>
-              <w:t>max. 500</w:t>
+              <w:t xml:space="preserve">max. </w:t>
+            </w:r>
+            <w:proofErr w:type="gramStart"/>
+            <w:r>
+              <w:rPr>
+                <w:shd w:val="clear" w:color="auto" w:fill="C5C5BD" w:themeFill="background2"/>
+              </w:rPr>
+              <w:t>500</w:t>
             </w:r>
             <w:r>
               <w:rPr>
                 <w:shd w:val="clear" w:color="auto" w:fill="C5C5BD" w:themeFill="background2"/>
               </w:rPr>
-              <w:t xml:space="preserve"> word summary here.</w:t>
+              <w:t xml:space="preserve"> word</w:t>
+            </w:r>
+            <w:proofErr w:type="gramEnd"/>
+            <w:r>
+              <w:rPr>
+                <w:shd w:val="clear" w:color="auto" w:fill="C5C5BD" w:themeFill="background2"/>
+              </w:rPr>
+              <w:t xml:space="preserve"> summary here.</w:t>
             </w:r>
           </w:p>
         </w:tc>
@@ -584,6 +614,96 @@
                 <w:color w:val="656966"/>
               </w:rPr>
               <w:t xml:space="preserve">applicant’s motivation to participate in the conference and potential impact on the applicant’s career. </w:t>
+            </w:r>
+          </w:p>
+        </w:tc>
+      </w:tr>
+      <w:tr>
+        <w:trPr>
+          <w:trHeight w:val="230"/>
+        </w:trPr>
+        <w:tc>
+          <w:tcPr>
+            <w:tcW w:w="9521" w:type="dxa"/>
+            <w:tcBorders>
+              <w:top w:val="nil"/>
+              <w:bottom w:val="nil"/>
+            </w:tcBorders>
+          </w:tcPr>
+          <w:p>
+            <w:pPr>
+              <w:spacing w:before="120"/>
+              <w:rPr>
+                <w:i/>
+                <w:iCs/>
+              </w:rPr>
+            </w:pPr>
+            <w:r>
+              <w:rPr>
+                <w:i/>
+                <w:iCs/>
+              </w:rPr>
+              <w:t>(max.</w:t>
+            </w:r>
+            <w:r>
+              <w:rPr>
+                <w:i/>
+                <w:iCs/>
+              </w:rPr>
+              <w:t>5</w:t>
+            </w:r>
+            <w:r>
+              <w:rPr>
+                <w:i/>
+                <w:iCs/>
+              </w:rPr>
+              <w:t xml:space="preserve">00 word) </w:t>
+            </w:r>
+          </w:p>
+          <w:p>
+            <w:pPr>
+              <w:spacing w:before="120"/>
+              <w:rPr>
+                <w:i/>
+              </w:rPr>
+            </w:pPr>
+            <w:r>
+              <w:rPr>
+                <w:shd w:val="clear" w:color="auto" w:fill="C5C5BD" w:themeFill="background2"/>
+              </w:rPr>
+              <w:t>Applicant</w:t>
+            </w:r>
+            <w:r>
+              <w:rPr>
+                <w:shd w:val="clear" w:color="auto" w:fill="C5C5BD" w:themeFill="background2"/>
+              </w:rPr>
+              <w:t xml:space="preserve"> enters </w:t>
+            </w:r>
+            <w:r>
+              <w:rPr>
+                <w:shd w:val="clear" w:color="auto" w:fill="C5C5BD" w:themeFill="background2"/>
+              </w:rPr>
+              <w:t xml:space="preserve">max. </w:t>
+            </w:r>
+            <w:proofErr w:type="gramStart"/>
+            <w:r>
+              <w:rPr>
+                <w:shd w:val="clear" w:color="auto" w:fill="C5C5BD" w:themeFill="background2"/>
+              </w:rPr>
+              <w:t>500</w:t>
+            </w:r>
+            <w:r>
+              <w:rPr>
+                <w:shd w:val="clear" w:color="auto" w:fill="C5C5BD" w:themeFill="background2"/>
+              </w:rPr>
+              <w:t xml:space="preserve"> word</w:t>
+            </w:r>
+            <w:proofErr w:type="gramEnd"/>
+            <w:r>
+              <w:rPr>
+                <w:shd w:val="clear" w:color="auto" w:fill="C5C5BD" w:themeFill="background2"/>
+              </w:rPr>
+              <w:t xml:space="preserve"> summary here.</w:t>
             </w:r>
           </w:p>
         </w:tc>
@@ -604,37 +724,55 @@
             <w:pPr>
               <w:spacing w:before="120"/>
               <w:rPr>
-                <w:i/>
-                <w:iCs/>
+                <w:b/>
+                <w:sz w:val="22"/>
+                <w:szCs w:val="22"/>
+                <w:u w:val="single"/>
               </w:rPr>
             </w:pPr>
             <w:r>
               <w:rPr>
-                <w:i/>
-                <w:iCs/>
-              </w:rPr>
-              <w:t>(max.</w:t>
+                <w:b/>
+                <w:sz w:val="22"/>
+                <w:szCs w:val="22"/>
+                <w:u w:val="single"/>
+              </w:rPr>
+              <w:t>Justification of expenses</w:t>
             </w:r>
             <w:r>
               <w:rPr>
-                <w:i/>
-                <w:iCs/>
-              </w:rPr>
-              <w:t>5</w:t>
-            </w:r>
-            <w:r>
-              <w:rPr>
-                <w:i/>
-                <w:iCs/>
-              </w:rPr>
-              <w:t xml:space="preserve">00 word) </w:t>
+                <w:b/>
+                <w:sz w:val="22"/>
+                <w:szCs w:val="22"/>
+                <w:u w:val="single"/>
+              </w:rPr>
+              <w:t xml:space="preserve">. </w:t>
             </w:r>
           </w:p>
           <w:p>
             <w:pPr>
               <w:spacing w:before="120"/>
               <w:rPr>
+                <w:bCs/>
+                <w:sz w:val="22"/>
+                <w:szCs w:val="22"/>
+              </w:rPr>
+            </w:pPr>
+            <w:r>
+              <w:rPr>
+                <w:bCs/>
+                <w:sz w:val="22"/>
+                <w:szCs w:val="22"/>
+              </w:rPr>
+              <w:t>Please include a clear justification of the requested expenses, including estimated travel, accommodation and subsistence costs where relevant, so that the Grant Reviewers can assess whether the proposed budget is reasonable and eligible</w:t>
+            </w:r>
+          </w:p>
+          <w:p>
+            <w:pPr>
+              <w:spacing w:before="120"/>
+              <w:rPr>
                 <w:i/>
+                <w:iCs/>
               </w:rPr>
             </w:pPr>
             <w:r>
@@ -647,19 +785,19 @@
               <w:rPr>
                 <w:shd w:val="clear" w:color="auto" w:fill="C5C5BD" w:themeFill="background2"/>
               </w:rPr>
-              <w:t xml:space="preserve"> enters </w:t>
+              <w:t xml:space="preserve"> enters</w:t>
             </w:r>
             <w:r>
               <w:rPr>
                 <w:shd w:val="clear" w:color="auto" w:fill="C5C5BD" w:themeFill="background2"/>
               </w:rPr>
-              <w:t>max. 500</w:t>
+              <w:t xml:space="preserve"> justification</w:t>
             </w:r>
             <w:r>
               <w:rPr>
                 <w:shd w:val="clear" w:color="auto" w:fill="C5C5BD" w:themeFill="background2"/>
               </w:rPr>
-              <w:t xml:space="preserve"> word summary here.</w:t>
+              <w:t xml:space="preserve"> here.</w:t>
             </w:r>
           </w:p>
         </w:tc>
@@ -684,7 +822,7 @@
 </file>
 
 <file path=word/endnotes.xml><?xml version="1.0" encoding="utf-8"?>
-<w:endnotes xmlns:wpc="http://schemas.microsoft.com/office/word/2010/wordprocessingCanvas" xmlns:cx="http://schemas.microsoft.com/office/drawing/2014/chartex" xmlns:cx1="http://schemas.microsoft.com/office/drawing/2015/9/8/chartex" xmlns:cx2="http://schemas.microsoft.com/office/drawing/2015/10/21/chartex" xmlns:cx3="http://schemas.microsoft.com/office/drawing/2016/5/9/chartex" xmlns:cx4="http://schemas.microsoft.com/office/drawing/2016/5/10/chartex" xmlns:cx5="http://schemas.microsoft.com/office/drawing/2016/5/11/chartex" xmlns:cx6="http://schemas.microsoft.com/office/drawing/2016/5/12/chartex" xmlns:cx7="http://schemas.microsoft.com/office/drawing/2016/5/13/chartex" xmlns:cx8="http://schemas.microsoft.com/office/drawing/2016/5/14/chartex" xmlns:mc="http://schemas.openxmlformats.org/markup-compatibility/2006" xmlns:aink="http://schemas.microsoft.com/office/drawing/2016/ink" xmlns:am3d="http://schemas.microsoft.com/office/drawing/2017/model3d" xmlns:o="urn:schemas-microsoft-com:office:office" xmlns:oel="http://schemas.microsoft.com/office/2019/extlst" xmlns:r="http://schemas.openxmlformats.org/officeDocument/2006/relationships" xmlns:m="http://schemas.openxmlformats.org/officeDocument/2006/math" xmlns:v="urn:schemas-microsoft-com:vml" xmlns:wp14="http://schemas.microsoft.com/office/word/2010/wordprocessingDrawing" xmlns:wp="http://schemas.openxmlformats.org/drawingml/2006/wordprocessingDrawing" xmlns:w10="urn:schemas-microsoft-com:office:word" xmlns:w="http://schemas.openxmlformats.org/wordprocessingml/2006/main" xmlns:w14="http://schemas.microsoft.com/office/word/2010/wordml" xmlns:w15="http://schemas.microsoft.com/office/word/2012/wordml" xmlns:w16cex="http://schemas.microsoft.com/office/word/2018/wordml/cex" xmlns:w16cid="http://schemas.microsoft.com/office/word/2016/wordml/cid" xmlns:w16="http://schemas.microsoft.com/office/word/2018/wordml" xmlns:w16du="http://schemas.microsoft.com/office/word/2023/wordml/word16du" xmlns:w16sdtdh="http://schemas.microsoft.com/office/word/2020/wordml/sdtdatahash" xmlns:w16se="http://schemas.microsoft.com/office/word/2015/wordml/symex" xmlns:wpg="http://schemas.microsoft.com/office/word/2010/wordprocessingGroup" xmlns:wpi="http://schemas.microsoft.com/office/word/2010/wordprocessingInk" xmlns:wne="http://schemas.microsoft.com/office/word/2006/wordml" xmlns:wps="http://schemas.microsoft.com/office/word/2010/wordprocessingShape" mc:Ignorable="w14 w15 w16se w16cid w16 w16cex w16sdtdh w16du wp14">
+<w:endnotes xmlns:wpc="http://schemas.microsoft.com/office/word/2010/wordprocessingCanvas" xmlns:cx="http://schemas.microsoft.com/office/drawing/2014/chartex" xmlns:cx1="http://schemas.microsoft.com/office/drawing/2015/9/8/chartex" xmlns:cx2="http://schemas.microsoft.com/office/drawing/2015/10/21/chartex" xmlns:cx3="http://schemas.microsoft.com/office/drawing/2016/5/9/chartex" xmlns:cx4="http://schemas.microsoft.com/office/drawing/2016/5/10/chartex" xmlns:cx5="http://schemas.microsoft.com/office/drawing/2016/5/11/chartex" xmlns:cx6="http://schemas.microsoft.com/office/drawing/2016/5/12/chartex" xmlns:cx7="http://schemas.microsoft.com/office/drawing/2016/5/13/chartex" xmlns:cx8="http://schemas.microsoft.com/office/drawing/2016/5/14/chartex" xmlns:mc="http://schemas.openxmlformats.org/markup-compatibility/2006" xmlns:aink="http://schemas.microsoft.com/office/drawing/2016/ink" xmlns:am3d="http://schemas.microsoft.com/office/drawing/2017/model3d" xmlns:o="urn:schemas-microsoft-com:office:office" xmlns:oel="http://schemas.microsoft.com/office/2019/extlst" xmlns:r="http://schemas.openxmlformats.org/officeDocument/2006/relationships" xmlns:m="http://schemas.openxmlformats.org/officeDocument/2006/math" xmlns:v="urn:schemas-microsoft-com:vml" xmlns:wp14="http://schemas.microsoft.com/office/word/2010/wordprocessingDrawing" xmlns:wp="http://schemas.openxmlformats.org/drawingml/2006/wordprocessingDrawing" xmlns:w10="urn:schemas-microsoft-com:office:word" xmlns:w="http://schemas.openxmlformats.org/wordprocessingml/2006/main" xmlns:w14="http://schemas.microsoft.com/office/word/2010/wordml" xmlns:w15="http://schemas.microsoft.com/office/word/2012/wordml" xmlns:w16cex="http://schemas.microsoft.com/office/word/2018/wordml/cex" xmlns:w16cid="http://schemas.microsoft.com/office/word/2016/wordml/cid" xmlns:w16="http://schemas.microsoft.com/office/word/2018/wordml" xmlns:w16du="http://schemas.microsoft.com/office/word/2023/wordml/word16du" xmlns:w16sdtdh="http://schemas.microsoft.com/office/word/2020/wordml/sdtdatahash" xmlns:w16sdtfl="http://schemas.microsoft.com/office/word/2024/wordml/sdtformatlock" xmlns:w16se="http://schemas.microsoft.com/office/word/2015/wordml/symex" xmlns:wpg="http://schemas.microsoft.com/office/word/2010/wordprocessingGroup" xmlns:wpi="http://schemas.microsoft.com/office/word/2010/wordprocessingInk" xmlns:wne="http://schemas.microsoft.com/office/word/2006/wordml" xmlns:wps="http://schemas.microsoft.com/office/word/2010/wordprocessingShape" mc:Ignorable="w14 w15 w16se w16cid w16 w16cex w16sdtdh w16sdtfl w16du wp14">
   <w:endnote w:type="separator" w:id="-1">
     <w:p>
       <w:r>
@@ -710,7 +848,7 @@
 </file>
 
 <file path=word/footer1.xml><?xml version="1.0" encoding="utf-8"?>
-<w:ftr xmlns:wpc="http://schemas.microsoft.com/office/word/2010/wordprocessingCanvas" xmlns:cx="http://schemas.microsoft.com/office/drawing/2014/chartex" xmlns:cx1="http://schemas.microsoft.com/office/drawing/2015/9/8/chartex" xmlns:cx2="http://schemas.microsoft.com/office/drawing/2015/10/21/chartex" xmlns:cx3="http://schemas.microsoft.com/office/drawing/2016/5/9/chartex" xmlns:cx4="http://schemas.microsoft.com/office/drawing/2016/5/10/chartex" xmlns:cx5="http://schemas.microsoft.com/office/drawing/2016/5/11/chartex" xmlns:cx6="http://schemas.microsoft.com/office/drawing/2016/5/12/chartex" xmlns:cx7="http://schemas.microsoft.com/office/drawing/2016/5/13/chartex" xmlns:cx8="http://schemas.microsoft.com/office/drawing/2016/5/14/chartex" xmlns:mc="http://schemas.openxmlformats.org/markup-compatibility/2006" xmlns:aink="http://schemas.microsoft.com/office/drawing/2016/ink" xmlns:am3d="http://schemas.microsoft.com/office/drawing/2017/model3d" xmlns:o="urn:schemas-microsoft-com:office:office" xmlns:oel="http://schemas.microsoft.com/office/2019/extlst" xmlns:r="http://schemas.openxmlformats.org/officeDocument/2006/relationships" xmlns:m="http://schemas.openxmlformats.org/officeDocument/2006/math" xmlns:v="urn:schemas-microsoft-com:vml" xmlns:wp14="http://schemas.microsoft.com/office/word/2010/wordprocessingDrawing" xmlns:wp="http://schemas.openxmlformats.org/drawingml/2006/wordprocessingDrawing" xmlns:w10="urn:schemas-microsoft-com:office:word" xmlns:w="http://schemas.openxmlformats.org/wordprocessingml/2006/main" xmlns:w14="http://schemas.microsoft.com/office/word/2010/wordml" xmlns:w15="http://schemas.microsoft.com/office/word/2012/wordml" xmlns:w16cex="http://schemas.microsoft.com/office/word/2018/wordml/cex" xmlns:w16cid="http://schemas.microsoft.com/office/word/2016/wordml/cid" xmlns:w16="http://schemas.microsoft.com/office/word/2018/wordml" xmlns:w16du="http://schemas.microsoft.com/office/word/2023/wordml/word16du" xmlns:w16sdtdh="http://schemas.microsoft.com/office/word/2020/wordml/sdtdatahash" xmlns:w16se="http://schemas.microsoft.com/office/word/2015/wordml/symex" xmlns:wpg="http://schemas.microsoft.com/office/word/2010/wordprocessingGroup" xmlns:wpi="http://schemas.microsoft.com/office/word/2010/wordprocessingInk" xmlns:wne="http://schemas.microsoft.com/office/word/2006/wordml" xmlns:wps="http://schemas.microsoft.com/office/word/2010/wordprocessingShape" mc:Ignorable="w14 w15 w16se w16cid w16 w16cex w16sdtdh w16du wp14">
+<w:ftr xmlns:wpc="http://schemas.microsoft.com/office/word/2010/wordprocessingCanvas" xmlns:cx="http://schemas.microsoft.com/office/drawing/2014/chartex" xmlns:cx1="http://schemas.microsoft.com/office/drawing/2015/9/8/chartex" xmlns:cx2="http://schemas.microsoft.com/office/drawing/2015/10/21/chartex" xmlns:cx3="http://schemas.microsoft.com/office/drawing/2016/5/9/chartex" xmlns:cx4="http://schemas.microsoft.com/office/drawing/2016/5/10/chartex" xmlns:cx5="http://schemas.microsoft.com/office/drawing/2016/5/11/chartex" xmlns:cx6="http://schemas.microsoft.com/office/drawing/2016/5/12/chartex" xmlns:cx7="http://schemas.microsoft.com/office/drawing/2016/5/13/chartex" xmlns:cx8="http://schemas.microsoft.com/office/drawing/2016/5/14/chartex" xmlns:mc="http://schemas.openxmlformats.org/markup-compatibility/2006" xmlns:aink="http://schemas.microsoft.com/office/drawing/2016/ink" xmlns:am3d="http://schemas.microsoft.com/office/drawing/2017/model3d" xmlns:o="urn:schemas-microsoft-com:office:office" xmlns:oel="http://schemas.microsoft.com/office/2019/extlst" xmlns:r="http://schemas.openxmlformats.org/officeDocument/2006/relationships" xmlns:m="http://schemas.openxmlformats.org/officeDocument/2006/math" xmlns:v="urn:schemas-microsoft-com:vml" xmlns:wp14="http://schemas.microsoft.com/office/word/2010/wordprocessingDrawing" xmlns:wp="http://schemas.openxmlformats.org/drawingml/2006/wordprocessingDrawing" xmlns:w10="urn:schemas-microsoft-com:office:word" xmlns:w="http://schemas.openxmlformats.org/wordprocessingml/2006/main" xmlns:w14="http://schemas.microsoft.com/office/word/2010/wordml" xmlns:w15="http://schemas.microsoft.com/office/word/2012/wordml" xmlns:w16cex="http://schemas.microsoft.com/office/word/2018/wordml/cex" xmlns:w16cid="http://schemas.microsoft.com/office/word/2016/wordml/cid" xmlns:w16="http://schemas.microsoft.com/office/word/2018/wordml" xmlns:w16du="http://schemas.microsoft.com/office/word/2023/wordml/word16du" xmlns:w16sdtdh="http://schemas.microsoft.com/office/word/2020/wordml/sdtdatahash" xmlns:w16sdtfl="http://schemas.microsoft.com/office/word/2024/wordml/sdtformatlock" xmlns:w16se="http://schemas.microsoft.com/office/word/2015/wordml/symex" xmlns:wpg="http://schemas.microsoft.com/office/word/2010/wordprocessingGroup" xmlns:wpi="http://schemas.microsoft.com/office/word/2010/wordprocessingInk" xmlns:wne="http://schemas.microsoft.com/office/word/2006/wordml" xmlns:wps="http://schemas.microsoft.com/office/word/2010/wordprocessingShape" mc:Ignorable="w14 w15 w16se w16cid w16 w16cex w16sdtdh w16sdtfl w16du wp14">
   <w:p>
     <w:pPr>
       <w:pStyle w:val="Footer"/>
@@ -720,7 +858,7 @@
 </file>
 
 <file path=word/footer2.xml><?xml version="1.0" encoding="utf-8"?>
-<w:ftr xmlns:wpc="http://schemas.microsoft.com/office/word/2010/wordprocessingCanvas" xmlns:cx="http://schemas.microsoft.com/office/drawing/2014/chartex" xmlns:cx1="http://schemas.microsoft.com/office/drawing/2015/9/8/chartex" xmlns:cx2="http://schemas.microsoft.com/office/drawing/2015/10/21/chartex" xmlns:cx3="http://schemas.microsoft.com/office/drawing/2016/5/9/chartex" xmlns:cx4="http://schemas.microsoft.com/office/drawing/2016/5/10/chartex" xmlns:cx5="http://schemas.microsoft.com/office/drawing/2016/5/11/chartex" xmlns:cx6="http://schemas.microsoft.com/office/drawing/2016/5/12/chartex" xmlns:cx7="http://schemas.microsoft.com/office/drawing/2016/5/13/chartex" xmlns:cx8="http://schemas.microsoft.com/office/drawing/2016/5/14/chartex" xmlns:mc="http://schemas.openxmlformats.org/markup-compatibility/2006" xmlns:aink="http://schemas.microsoft.com/office/drawing/2016/ink" xmlns:am3d="http://schemas.microsoft.com/office/drawing/2017/model3d" xmlns:o="urn:schemas-microsoft-com:office:office" xmlns:oel="http://schemas.microsoft.com/office/2019/extlst" xmlns:r="http://schemas.openxmlformats.org/officeDocument/2006/relationships" xmlns:m="http://schemas.openxmlformats.org/officeDocument/2006/math" xmlns:v="urn:schemas-microsoft-com:vml" xmlns:wp14="http://schemas.microsoft.com/office/word/2010/wordprocessingDrawing" xmlns:wp="http://schemas.openxmlformats.org/drawingml/2006/wordprocessingDrawing" xmlns:w10="urn:schemas-microsoft-com:office:word" xmlns:w="http://schemas.openxmlformats.org/wordprocessingml/2006/main" xmlns:w14="http://schemas.microsoft.com/office/word/2010/wordml" xmlns:w15="http://schemas.microsoft.com/office/word/2012/wordml" xmlns:w16cex="http://schemas.microsoft.com/office/word/2018/wordml/cex" xmlns:w16cid="http://schemas.microsoft.com/office/word/2016/wordml/cid" xmlns:w16="http://schemas.microsoft.com/office/word/2018/wordml" xmlns:w16du="http://schemas.microsoft.com/office/word/2023/wordml/word16du" xmlns:w16sdtdh="http://schemas.microsoft.com/office/word/2020/wordml/sdtdatahash" xmlns:w16se="http://schemas.microsoft.com/office/word/2015/wordml/symex" xmlns:wpg="http://schemas.microsoft.com/office/word/2010/wordprocessingGroup" xmlns:wpi="http://schemas.microsoft.com/office/word/2010/wordprocessingInk" xmlns:wne="http://schemas.microsoft.com/office/word/2006/wordml" xmlns:wps="http://schemas.microsoft.com/office/word/2010/wordprocessingShape" mc:Ignorable="w14 w15 w16se w16cid w16 w16cex w16sdtdh w16du wp14">
+<w:ftr xmlns:wpc="http://schemas.microsoft.com/office/word/2010/wordprocessingCanvas" xmlns:cx="http://schemas.microsoft.com/office/drawing/2014/chartex" xmlns:cx1="http://schemas.microsoft.com/office/drawing/2015/9/8/chartex" xmlns:cx2="http://schemas.microsoft.com/office/drawing/2015/10/21/chartex" xmlns:cx3="http://schemas.microsoft.com/office/drawing/2016/5/9/chartex" xmlns:cx4="http://schemas.microsoft.com/office/drawing/2016/5/10/chartex" xmlns:cx5="http://schemas.microsoft.com/office/drawing/2016/5/11/chartex" xmlns:cx6="http://schemas.microsoft.com/office/drawing/2016/5/12/chartex" xmlns:cx7="http://schemas.microsoft.com/office/drawing/2016/5/13/chartex" xmlns:cx8="http://schemas.microsoft.com/office/drawing/2016/5/14/chartex" xmlns:mc="http://schemas.openxmlformats.org/markup-compatibility/2006" xmlns:aink="http://schemas.microsoft.com/office/drawing/2016/ink" xmlns:am3d="http://schemas.microsoft.com/office/drawing/2017/model3d" xmlns:o="urn:schemas-microsoft-com:office:office" xmlns:oel="http://schemas.microsoft.com/office/2019/extlst" xmlns:r="http://schemas.openxmlformats.org/officeDocument/2006/relationships" xmlns:m="http://schemas.openxmlformats.org/officeDocument/2006/math" xmlns:v="urn:schemas-microsoft-com:vml" xmlns:wp14="http://schemas.microsoft.com/office/word/2010/wordprocessingDrawing" xmlns:wp="http://schemas.openxmlformats.org/drawingml/2006/wordprocessingDrawing" xmlns:w10="urn:schemas-microsoft-com:office:word" xmlns:w="http://schemas.openxmlformats.org/wordprocessingml/2006/main" xmlns:w14="http://schemas.microsoft.com/office/word/2010/wordml" xmlns:w15="http://schemas.microsoft.com/office/word/2012/wordml" xmlns:w16cex="http://schemas.microsoft.com/office/word/2018/wordml/cex" xmlns:w16cid="http://schemas.microsoft.com/office/word/2016/wordml/cid" xmlns:w16="http://schemas.microsoft.com/office/word/2018/wordml" xmlns:w16du="http://schemas.microsoft.com/office/word/2023/wordml/word16du" xmlns:w16sdtdh="http://schemas.microsoft.com/office/word/2020/wordml/sdtdatahash" xmlns:w16sdtfl="http://schemas.microsoft.com/office/word/2024/wordml/sdtformatlock" xmlns:w16se="http://schemas.microsoft.com/office/word/2015/wordml/symex" xmlns:wpg="http://schemas.microsoft.com/office/word/2010/wordprocessingGroup" xmlns:wpi="http://schemas.microsoft.com/office/word/2010/wordprocessingInk" xmlns:wne="http://schemas.microsoft.com/office/word/2006/wordml" xmlns:wps="http://schemas.microsoft.com/office/word/2010/wordprocessingShape" mc:Ignorable="w14 w15 w16se w16cid w16 w16cex w16sdtdh w16sdtfl w16du wp14">
   <w:p>
     <w:pPr>
       <w:pStyle w:val="Footer"/>
@@ -926,7 +1064,7 @@
 </file>
 
 <file path=word/footer3.xml><?xml version="1.0" encoding="utf-8"?>
-<w:ftr xmlns:wpc="http://schemas.microsoft.com/office/word/2010/wordprocessingCanvas" xmlns:cx="http://schemas.microsoft.com/office/drawing/2014/chartex" xmlns:cx1="http://schemas.microsoft.com/office/drawing/2015/9/8/chartex" xmlns:cx2="http://schemas.microsoft.com/office/drawing/2015/10/21/chartex" xmlns:cx3="http://schemas.microsoft.com/office/drawing/2016/5/9/chartex" xmlns:cx4="http://schemas.microsoft.com/office/drawing/2016/5/10/chartex" xmlns:cx5="http://schemas.microsoft.com/office/drawing/2016/5/11/chartex" xmlns:cx6="http://schemas.microsoft.com/office/drawing/2016/5/12/chartex" xmlns:cx7="http://schemas.microsoft.com/office/drawing/2016/5/13/chartex" xmlns:cx8="http://schemas.microsoft.com/office/drawing/2016/5/14/chartex" xmlns:mc="http://schemas.openxmlformats.org/markup-compatibility/2006" xmlns:aink="http://schemas.microsoft.com/office/drawing/2016/ink" xmlns:am3d="http://schemas.microsoft.com/office/drawing/2017/model3d" xmlns:o="urn:schemas-microsoft-com:office:office" xmlns:oel="http://schemas.microsoft.com/office/2019/extlst" xmlns:r="http://schemas.openxmlformats.org/officeDocument/2006/relationships" xmlns:m="http://schemas.openxmlformats.org/officeDocument/2006/math" xmlns:v="urn:schemas-microsoft-com:vml" xmlns:wp14="http://schemas.microsoft.com/office/word/2010/wordprocessingDrawing" xmlns:wp="http://schemas.openxmlformats.org/drawingml/2006/wordprocessingDrawing" xmlns:w10="urn:schemas-microsoft-com:office:word" xmlns:w="http://schemas.openxmlformats.org/wordprocessingml/2006/main" xmlns:w14="http://schemas.microsoft.com/office/word/2010/wordml" xmlns:w15="http://schemas.microsoft.com/office/word/2012/wordml" xmlns:w16cex="http://schemas.microsoft.com/office/word/2018/wordml/cex" xmlns:w16cid="http://schemas.microsoft.com/office/word/2016/wordml/cid" xmlns:w16="http://schemas.microsoft.com/office/word/2018/wordml" xmlns:w16du="http://schemas.microsoft.com/office/word/2023/wordml/word16du" xmlns:w16sdtdh="http://schemas.microsoft.com/office/word/2020/wordml/sdtdatahash" xmlns:w16se="http://schemas.microsoft.com/office/word/2015/wordml/symex" xmlns:wpg="http://schemas.microsoft.com/office/word/2010/wordprocessingGroup" xmlns:wpi="http://schemas.microsoft.com/office/word/2010/wordprocessingInk" xmlns:wne="http://schemas.microsoft.com/office/word/2006/wordml" xmlns:wps="http://schemas.microsoft.com/office/word/2010/wordprocessingShape" mc:Ignorable="w14 w15 w16se w16cid w16 w16cex w16sdtdh w16du wp14">
+<w:ftr xmlns:wpc="http://schemas.microsoft.com/office/word/2010/wordprocessingCanvas" xmlns:cx="http://schemas.microsoft.com/office/drawing/2014/chartex" xmlns:cx1="http://schemas.microsoft.com/office/drawing/2015/9/8/chartex" xmlns:cx2="http://schemas.microsoft.com/office/drawing/2015/10/21/chartex" xmlns:cx3="http://schemas.microsoft.com/office/drawing/2016/5/9/chartex" xmlns:cx4="http://schemas.microsoft.com/office/drawing/2016/5/10/chartex" xmlns:cx5="http://schemas.microsoft.com/office/drawing/2016/5/11/chartex" xmlns:cx6="http://schemas.microsoft.com/office/drawing/2016/5/12/chartex" xmlns:cx7="http://schemas.microsoft.com/office/drawing/2016/5/13/chartex" xmlns:cx8="http://schemas.microsoft.com/office/drawing/2016/5/14/chartex" xmlns:mc="http://schemas.openxmlformats.org/markup-compatibility/2006" xmlns:aink="http://schemas.microsoft.com/office/drawing/2016/ink" xmlns:am3d="http://schemas.microsoft.com/office/drawing/2017/model3d" xmlns:o="urn:schemas-microsoft-com:office:office" xmlns:oel="http://schemas.microsoft.com/office/2019/extlst" xmlns:r="http://schemas.openxmlformats.org/officeDocument/2006/relationships" xmlns:m="http://schemas.openxmlformats.org/officeDocument/2006/math" xmlns:v="urn:schemas-microsoft-com:vml" xmlns:wp14="http://schemas.microsoft.com/office/word/2010/wordprocessingDrawing" xmlns:wp="http://schemas.openxmlformats.org/drawingml/2006/wordprocessingDrawing" xmlns:w10="urn:schemas-microsoft-com:office:word" xmlns:w="http://schemas.openxmlformats.org/wordprocessingml/2006/main" xmlns:w14="http://schemas.microsoft.com/office/word/2010/wordml" xmlns:w15="http://schemas.microsoft.com/office/word/2012/wordml" xmlns:w16cex="http://schemas.microsoft.com/office/word/2018/wordml/cex" xmlns:w16cid="http://schemas.microsoft.com/office/word/2016/wordml/cid" xmlns:w16="http://schemas.microsoft.com/office/word/2018/wordml" xmlns:w16du="http://schemas.microsoft.com/office/word/2023/wordml/word16du" xmlns:w16sdtdh="http://schemas.microsoft.com/office/word/2020/wordml/sdtdatahash" xmlns:w16sdtfl="http://schemas.microsoft.com/office/word/2024/wordml/sdtformatlock" xmlns:w16se="http://schemas.microsoft.com/office/word/2015/wordml/symex" xmlns:wpg="http://schemas.microsoft.com/office/word/2010/wordprocessingGroup" xmlns:wpi="http://schemas.microsoft.com/office/word/2010/wordprocessingInk" xmlns:wne="http://schemas.microsoft.com/office/word/2006/wordml" xmlns:wps="http://schemas.microsoft.com/office/word/2010/wordprocessingShape" mc:Ignorable="w14 w15 w16se w16cid w16 w16cex w16sdtdh w16sdtfl w16du wp14">
   <w:p>
     <w:pPr>
       <w:pStyle w:val="Footer"/>
@@ -1192,7 +1330,7 @@
 </file>
 
 <file path=word/footnotes.xml><?xml version="1.0" encoding="utf-8"?>
-<w:footnotes xmlns:wpc="http://schemas.microsoft.com/office/word/2010/wordprocessingCanvas" xmlns:cx="http://schemas.microsoft.com/office/drawing/2014/chartex" xmlns:cx1="http://schemas.microsoft.com/office/drawing/2015/9/8/chartex" xmlns:cx2="http://schemas.microsoft.com/office/drawing/2015/10/21/chartex" xmlns:cx3="http://schemas.microsoft.com/office/drawing/2016/5/9/chartex" xmlns:cx4="http://schemas.microsoft.com/office/drawing/2016/5/10/chartex" xmlns:cx5="http://schemas.microsoft.com/office/drawing/2016/5/11/chartex" xmlns:cx6="http://schemas.microsoft.com/office/drawing/2016/5/12/chartex" xmlns:cx7="http://schemas.microsoft.com/office/drawing/2016/5/13/chartex" xmlns:cx8="http://schemas.microsoft.com/office/drawing/2016/5/14/chartex" xmlns:mc="http://schemas.openxmlformats.org/markup-compatibility/2006" xmlns:aink="http://schemas.microsoft.com/office/drawing/2016/ink" xmlns:am3d="http://schemas.microsoft.com/office/drawing/2017/model3d" xmlns:o="urn:schemas-microsoft-com:office:office" xmlns:oel="http://schemas.microsoft.com/office/2019/extlst" xmlns:r="http://schemas.openxmlformats.org/officeDocument/2006/relationships" xmlns:m="http://schemas.openxmlformats.org/officeDocument/2006/math" xmlns:v="urn:schemas-microsoft-com:vml" xmlns:wp14="http://schemas.microsoft.com/office/word/2010/wordprocessingDrawing" xmlns:wp="http://schemas.openxmlformats.org/drawingml/2006/wordprocessingDrawing" xmlns:w10="urn:schemas-microsoft-com:office:word" xmlns:w="http://schemas.openxmlformats.org/wordprocessingml/2006/main" xmlns:w14="http://schemas.microsoft.com/office/word/2010/wordml" xmlns:w15="http://schemas.microsoft.com/office/word/2012/wordml" xmlns:w16cex="http://schemas.microsoft.com/office/word/2018/wordml/cex" xmlns:w16cid="http://schemas.microsoft.com/office/word/2016/wordml/cid" xmlns:w16="http://schemas.microsoft.com/office/word/2018/wordml" xmlns:w16du="http://schemas.microsoft.com/office/word/2023/wordml/word16du" xmlns:w16sdtdh="http://schemas.microsoft.com/office/word/2020/wordml/sdtdatahash" xmlns:w16se="http://schemas.microsoft.com/office/word/2015/wordml/symex" xmlns:wpg="http://schemas.microsoft.com/office/word/2010/wordprocessingGroup" xmlns:wpi="http://schemas.microsoft.com/office/word/2010/wordprocessingInk" xmlns:wne="http://schemas.microsoft.com/office/word/2006/wordml" xmlns:wps="http://schemas.microsoft.com/office/word/2010/wordprocessingShape" mc:Ignorable="w14 w15 w16se w16cid w16 w16cex w16sdtdh w16du wp14">
+<w:footnotes xmlns:wpc="http://schemas.microsoft.com/office/word/2010/wordprocessingCanvas" xmlns:cx="http://schemas.microsoft.com/office/drawing/2014/chartex" xmlns:cx1="http://schemas.microsoft.com/office/drawing/2015/9/8/chartex" xmlns:cx2="http://schemas.microsoft.com/office/drawing/2015/10/21/chartex" xmlns:cx3="http://schemas.microsoft.com/office/drawing/2016/5/9/chartex" xmlns:cx4="http://schemas.microsoft.com/office/drawing/2016/5/10/chartex" xmlns:cx5="http://schemas.microsoft.com/office/drawing/2016/5/11/chartex" xmlns:cx6="http://schemas.microsoft.com/office/drawing/2016/5/12/chartex" xmlns:cx7="http://schemas.microsoft.com/office/drawing/2016/5/13/chartex" xmlns:cx8="http://schemas.microsoft.com/office/drawing/2016/5/14/chartex" xmlns:mc="http://schemas.openxmlformats.org/markup-compatibility/2006" xmlns:aink="http://schemas.microsoft.com/office/drawing/2016/ink" xmlns:am3d="http://schemas.microsoft.com/office/drawing/2017/model3d" xmlns:o="urn:schemas-microsoft-com:office:office" xmlns:oel="http://schemas.microsoft.com/office/2019/extlst" xmlns:r="http://schemas.openxmlformats.org/officeDocument/2006/relationships" xmlns:m="http://schemas.openxmlformats.org/officeDocument/2006/math" xmlns:v="urn:schemas-microsoft-com:vml" xmlns:wp14="http://schemas.microsoft.com/office/word/2010/wordprocessingDrawing" xmlns:wp="http://schemas.openxmlformats.org/drawingml/2006/wordprocessingDrawing" xmlns:w10="urn:schemas-microsoft-com:office:word" xmlns:w="http://schemas.openxmlformats.org/wordprocessingml/2006/main" xmlns:w14="http://schemas.microsoft.com/office/word/2010/wordml" xmlns:w15="http://schemas.microsoft.com/office/word/2012/wordml" xmlns:w16cex="http://schemas.microsoft.com/office/word/2018/wordml/cex" xmlns:w16cid="http://schemas.microsoft.com/office/word/2016/wordml/cid" xmlns:w16="http://schemas.microsoft.com/office/word/2018/wordml" xmlns:w16du="http://schemas.microsoft.com/office/word/2023/wordml/word16du" xmlns:w16sdtdh="http://schemas.microsoft.com/office/word/2020/wordml/sdtdatahash" xmlns:w16sdtfl="http://schemas.microsoft.com/office/word/2024/wordml/sdtformatlock" xmlns:w16se="http://schemas.microsoft.com/office/word/2015/wordml/symex" xmlns:wpg="http://schemas.microsoft.com/office/word/2010/wordprocessingGroup" xmlns:wpi="http://schemas.microsoft.com/office/word/2010/wordprocessingInk" xmlns:wne="http://schemas.microsoft.com/office/word/2006/wordml" xmlns:wps="http://schemas.microsoft.com/office/word/2010/wordprocessingShape" mc:Ignorable="w14 w15 w16se w16cid w16 w16cex w16sdtdh w16sdtfl w16du wp14">
   <w:footnote w:type="separator" w:id="-1">
     <w:p>
       <w:r>
@@ -1232,12 +1370,21 @@
       <w:r>
         <w:t xml:space="preserve"> </w:t>
       </w:r>
+      <w:proofErr w:type="gramStart"/>
       <w:r>
         <w:rPr>
           <w:rFonts w:ascii="ArialMT" w:hAnsi="ArialMT" w:cs="ArialMT"/>
           <w:color w:val="656966"/>
         </w:rPr>
-        <w:t xml:space="preserve">This  form is part of the application for a grant to present the </w:t>
+        <w:t>This  form</w:t>
+      </w:r>
+      <w:proofErr w:type="gramEnd"/>
+      <w:r>
+        <w:rPr>
+          <w:rFonts w:ascii="ArialMT" w:hAnsi="ArialMT" w:cs="ArialMT"/>
+          <w:color w:val="656966"/>
+        </w:rPr>
+        <w:t xml:space="preserve"> is part of the application for a grant to present the </w:t>
       </w:r>
       <w:r>
         <w:rPr>
@@ -1251,7 +1398,23 @@
           <w:rFonts w:ascii="ArialMT" w:hAnsi="ArialMT" w:cs="ArialMT"/>
           <w:color w:val="656966"/>
         </w:rPr>
-        <w:t xml:space="preserve"> conference.  It  is submitted to the COST Action MC via-e-COST. The</w:t>
+        <w:t xml:space="preserve"> conference.  </w:t>
+      </w:r>
+      <w:proofErr w:type="gramStart"/>
+      <w:r>
+        <w:rPr>
+          <w:rFonts w:ascii="ArialMT" w:hAnsi="ArialMT" w:cs="ArialMT"/>
+          <w:color w:val="656966"/>
+        </w:rPr>
+        <w:t>It  is</w:t>
+      </w:r>
+      <w:proofErr w:type="gramEnd"/>
+      <w:r>
+        <w:rPr>
+          <w:rFonts w:ascii="ArialMT" w:hAnsi="ArialMT" w:cs="ArialMT"/>
+          <w:color w:val="656966"/>
+        </w:rPr>
+        <w:t xml:space="preserve"> submitted to the COST Action MC via-e-COST. The</w:t>
       </w:r>
       <w:r>
         <w:rPr>
@@ -1324,7 +1487,7 @@
 </file>
 
 <file path=word/header1.xml><?xml version="1.0" encoding="utf-8"?>
-<w:hdr xmlns:wpc="http://schemas.microsoft.com/office/word/2010/wordprocessingCanvas" xmlns:cx="http://schemas.microsoft.com/office/drawing/2014/chartex" xmlns:cx1="http://schemas.microsoft.com/office/drawing/2015/9/8/chartex" xmlns:cx2="http://schemas.microsoft.com/office/drawing/2015/10/21/chartex" xmlns:cx3="http://schemas.microsoft.com/office/drawing/2016/5/9/chartex" xmlns:cx4="http://schemas.microsoft.com/office/drawing/2016/5/10/chartex" xmlns:cx5="http://schemas.microsoft.com/office/drawing/2016/5/11/chartex" xmlns:cx6="http://schemas.microsoft.com/office/drawing/2016/5/12/chartex" xmlns:cx7="http://schemas.microsoft.com/office/drawing/2016/5/13/chartex" xmlns:cx8="http://schemas.microsoft.com/office/drawing/2016/5/14/chartex" xmlns:mc="http://schemas.openxmlformats.org/markup-compatibility/2006" xmlns:aink="http://schemas.microsoft.com/office/drawing/2016/ink" xmlns:am3d="http://schemas.microsoft.com/office/drawing/2017/model3d" xmlns:o="urn:schemas-microsoft-com:office:office" xmlns:oel="http://schemas.microsoft.com/office/2019/extlst" xmlns:r="http://schemas.openxmlformats.org/officeDocument/2006/relationships" xmlns:m="http://schemas.openxmlformats.org/officeDocument/2006/math" xmlns:v="urn:schemas-microsoft-com:vml" xmlns:wp14="http://schemas.microsoft.com/office/word/2010/wordprocessingDrawing" xmlns:wp="http://schemas.openxmlformats.org/drawingml/2006/wordprocessingDrawing" xmlns:w10="urn:schemas-microsoft-com:office:word" xmlns:w="http://schemas.openxmlformats.org/wordprocessingml/2006/main" xmlns:w14="http://schemas.microsoft.com/office/word/2010/wordml" xmlns:w15="http://schemas.microsoft.com/office/word/2012/wordml" xmlns:w16cex="http://schemas.microsoft.com/office/word/2018/wordml/cex" xmlns:w16cid="http://schemas.microsoft.com/office/word/2016/wordml/cid" xmlns:w16="http://schemas.microsoft.com/office/word/2018/wordml" xmlns:w16du="http://schemas.microsoft.com/office/word/2023/wordml/word16du" xmlns:w16sdtdh="http://schemas.microsoft.com/office/word/2020/wordml/sdtdatahash" xmlns:w16se="http://schemas.microsoft.com/office/word/2015/wordml/symex" xmlns:wpg="http://schemas.microsoft.com/office/word/2010/wordprocessingGroup" xmlns:wpi="http://schemas.microsoft.com/office/word/2010/wordprocessingInk" xmlns:wne="http://schemas.microsoft.com/office/word/2006/wordml" xmlns:wps="http://schemas.microsoft.com/office/word/2010/wordprocessingShape" mc:Ignorable="w14 w15 w16se w16cid w16 w16cex w16sdtdh w16du wp14">
+<w:hdr xmlns:wpc="http://schemas.microsoft.com/office/word/2010/wordprocessingCanvas" xmlns:cx="http://schemas.microsoft.com/office/drawing/2014/chartex" xmlns:cx1="http://schemas.microsoft.com/office/drawing/2015/9/8/chartex" xmlns:cx2="http://schemas.microsoft.com/office/drawing/2015/10/21/chartex" xmlns:cx3="http://schemas.microsoft.com/office/drawing/2016/5/9/chartex" xmlns:cx4="http://schemas.microsoft.com/office/drawing/2016/5/10/chartex" xmlns:cx5="http://schemas.microsoft.com/office/drawing/2016/5/11/chartex" xmlns:cx6="http://schemas.microsoft.com/office/drawing/2016/5/12/chartex" xmlns:cx7="http://schemas.microsoft.com/office/drawing/2016/5/13/chartex" xmlns:cx8="http://schemas.microsoft.com/office/drawing/2016/5/14/chartex" xmlns:mc="http://schemas.openxmlformats.org/markup-compatibility/2006" xmlns:aink="http://schemas.microsoft.com/office/drawing/2016/ink" xmlns:am3d="http://schemas.microsoft.com/office/drawing/2017/model3d" xmlns:o="urn:schemas-microsoft-com:office:office" xmlns:oel="http://schemas.microsoft.com/office/2019/extlst" xmlns:r="http://schemas.openxmlformats.org/officeDocument/2006/relationships" xmlns:m="http://schemas.openxmlformats.org/officeDocument/2006/math" xmlns:v="urn:schemas-microsoft-com:vml" xmlns:wp14="http://schemas.microsoft.com/office/word/2010/wordprocessingDrawing" xmlns:wp="http://schemas.openxmlformats.org/drawingml/2006/wordprocessingDrawing" xmlns:w10="urn:schemas-microsoft-com:office:word" xmlns:w="http://schemas.openxmlformats.org/wordprocessingml/2006/main" xmlns:w14="http://schemas.microsoft.com/office/word/2010/wordml" xmlns:w15="http://schemas.microsoft.com/office/word/2012/wordml" xmlns:w16cex="http://schemas.microsoft.com/office/word/2018/wordml/cex" xmlns:w16cid="http://schemas.microsoft.com/office/word/2016/wordml/cid" xmlns:w16="http://schemas.microsoft.com/office/word/2018/wordml" xmlns:w16du="http://schemas.microsoft.com/office/word/2023/wordml/word16du" xmlns:w16sdtdh="http://schemas.microsoft.com/office/word/2020/wordml/sdtdatahash" xmlns:w16sdtfl="http://schemas.microsoft.com/office/word/2024/wordml/sdtformatlock" xmlns:w16se="http://schemas.microsoft.com/office/word/2015/wordml/symex" xmlns:wpg="http://schemas.microsoft.com/office/word/2010/wordprocessingGroup" xmlns:wpi="http://schemas.microsoft.com/office/word/2010/wordprocessingInk" xmlns:wne="http://schemas.microsoft.com/office/word/2006/wordml" xmlns:wps="http://schemas.microsoft.com/office/word/2010/wordprocessingShape" mc:Ignorable="w14 w15 w16se w16cid w16 w16cex w16sdtdh w16sdtfl w16du wp14">
   <w:p>
     <w:pPr>
       <w:pStyle w:val="Header"/>
@@ -1334,7 +1497,7 @@
 </file>
 
 <file path=word/header2.xml><?xml version="1.0" encoding="utf-8"?>
-<w:hdr xmlns:wpc="http://schemas.microsoft.com/office/word/2010/wordprocessingCanvas" xmlns:cx="http://schemas.microsoft.com/office/drawing/2014/chartex" xmlns:cx1="http://schemas.microsoft.com/office/drawing/2015/9/8/chartex" xmlns:cx2="http://schemas.microsoft.com/office/drawing/2015/10/21/chartex" xmlns:cx3="http://schemas.microsoft.com/office/drawing/2016/5/9/chartex" xmlns:cx4="http://schemas.microsoft.com/office/drawing/2016/5/10/chartex" xmlns:cx5="http://schemas.microsoft.com/office/drawing/2016/5/11/chartex" xmlns:cx6="http://schemas.microsoft.com/office/drawing/2016/5/12/chartex" xmlns:cx7="http://schemas.microsoft.com/office/drawing/2016/5/13/chartex" xmlns:cx8="http://schemas.microsoft.com/office/drawing/2016/5/14/chartex" xmlns:mc="http://schemas.openxmlformats.org/markup-compatibility/2006" xmlns:aink="http://schemas.microsoft.com/office/drawing/2016/ink" xmlns:am3d="http://schemas.microsoft.com/office/drawing/2017/model3d" xmlns:o="urn:schemas-microsoft-com:office:office" xmlns:oel="http://schemas.microsoft.com/office/2019/extlst" xmlns:r="http://schemas.openxmlformats.org/officeDocument/2006/relationships" xmlns:m="http://schemas.openxmlformats.org/officeDocument/2006/math" xmlns:v="urn:schemas-microsoft-com:vml" xmlns:wp14="http://schemas.microsoft.com/office/word/2010/wordprocessingDrawing" xmlns:wp="http://schemas.openxmlformats.org/drawingml/2006/wordprocessingDrawing" xmlns:w10="urn:schemas-microsoft-com:office:word" xmlns:w="http://schemas.openxmlformats.org/wordprocessingml/2006/main" xmlns:w14="http://schemas.microsoft.com/office/word/2010/wordml" xmlns:w15="http://schemas.microsoft.com/office/word/2012/wordml" xmlns:w16cex="http://schemas.microsoft.com/office/word/2018/wordml/cex" xmlns:w16cid="http://schemas.microsoft.com/office/word/2016/wordml/cid" xmlns:w16="http://schemas.microsoft.com/office/word/2018/wordml" xmlns:w16du="http://schemas.microsoft.com/office/word/2023/wordml/word16du" xmlns:w16sdtdh="http://schemas.microsoft.com/office/word/2020/wordml/sdtdatahash" xmlns:w16se="http://schemas.microsoft.com/office/word/2015/wordml/symex" xmlns:wpg="http://schemas.microsoft.com/office/word/2010/wordprocessingGroup" xmlns:wpi="http://schemas.microsoft.com/office/word/2010/wordprocessingInk" xmlns:wne="http://schemas.microsoft.com/office/word/2006/wordml" xmlns:wps="http://schemas.microsoft.com/office/word/2010/wordprocessingShape" mc:Ignorable="w14 w15 w16se w16cid w16 w16cex w16sdtdh w16du wp14">
+<w:hdr xmlns:wpc="http://schemas.microsoft.com/office/word/2010/wordprocessingCanvas" xmlns:cx="http://schemas.microsoft.com/office/drawing/2014/chartex" xmlns:cx1="http://schemas.microsoft.com/office/drawing/2015/9/8/chartex" xmlns:cx2="http://schemas.microsoft.com/office/drawing/2015/10/21/chartex" xmlns:cx3="http://schemas.microsoft.com/office/drawing/2016/5/9/chartex" xmlns:cx4="http://schemas.microsoft.com/office/drawing/2016/5/10/chartex" xmlns:cx5="http://schemas.microsoft.com/office/drawing/2016/5/11/chartex" xmlns:cx6="http://schemas.microsoft.com/office/drawing/2016/5/12/chartex" xmlns:cx7="http://schemas.microsoft.com/office/drawing/2016/5/13/chartex" xmlns:cx8="http://schemas.microsoft.com/office/drawing/2016/5/14/chartex" xmlns:mc="http://schemas.openxmlformats.org/markup-compatibility/2006" xmlns:aink="http://schemas.microsoft.com/office/drawing/2016/ink" xmlns:am3d="http://schemas.microsoft.com/office/drawing/2017/model3d" xmlns:o="urn:schemas-microsoft-com:office:office" xmlns:oel="http://schemas.microsoft.com/office/2019/extlst" xmlns:r="http://schemas.openxmlformats.org/officeDocument/2006/relationships" xmlns:m="http://schemas.openxmlformats.org/officeDocument/2006/math" xmlns:v="urn:schemas-microsoft-com:vml" xmlns:wp14="http://schemas.microsoft.com/office/word/2010/wordprocessingDrawing" xmlns:wp="http://schemas.openxmlformats.org/drawingml/2006/wordprocessingDrawing" xmlns:w10="urn:schemas-microsoft-com:office:word" xmlns:w="http://schemas.openxmlformats.org/wordprocessingml/2006/main" xmlns:w14="http://schemas.microsoft.com/office/word/2010/wordml" xmlns:w15="http://schemas.microsoft.com/office/word/2012/wordml" xmlns:w16cex="http://schemas.microsoft.com/office/word/2018/wordml/cex" xmlns:w16cid="http://schemas.microsoft.com/office/word/2016/wordml/cid" xmlns:w16="http://schemas.microsoft.com/office/word/2018/wordml" xmlns:w16du="http://schemas.microsoft.com/office/word/2023/wordml/word16du" xmlns:w16sdtdh="http://schemas.microsoft.com/office/word/2020/wordml/sdtdatahash" xmlns:w16sdtfl="http://schemas.microsoft.com/office/word/2024/wordml/sdtformatlock" xmlns:w16se="http://schemas.microsoft.com/office/word/2015/wordml/symex" xmlns:wpg="http://schemas.microsoft.com/office/word/2010/wordprocessingGroup" xmlns:wpi="http://schemas.microsoft.com/office/word/2010/wordprocessingInk" xmlns:wne="http://schemas.microsoft.com/office/word/2006/wordml" xmlns:wps="http://schemas.microsoft.com/office/word/2010/wordprocessingShape" mc:Ignorable="w14 w15 w16se w16cid w16 w16cex w16sdtdh w16sdtfl w16du wp14">
   <w:p>
     <w:pPr>
       <w:pStyle w:val="Header"/>
@@ -1405,7 +1568,7 @@
 </file>
 
 <file path=word/header3.xml><?xml version="1.0" encoding="utf-8"?>
-<w:hdr xmlns:wpc="http://schemas.microsoft.com/office/word/2010/wordprocessingCanvas" xmlns:cx="http://schemas.microsoft.com/office/drawing/2014/chartex" xmlns:cx1="http://schemas.microsoft.com/office/drawing/2015/9/8/chartex" xmlns:cx2="http://schemas.microsoft.com/office/drawing/2015/10/21/chartex" xmlns:cx3="http://schemas.microsoft.com/office/drawing/2016/5/9/chartex" xmlns:cx4="http://schemas.microsoft.com/office/drawing/2016/5/10/chartex" xmlns:cx5="http://schemas.microsoft.com/office/drawing/2016/5/11/chartex" xmlns:cx6="http://schemas.microsoft.com/office/drawing/2016/5/12/chartex" xmlns:cx7="http://schemas.microsoft.com/office/drawing/2016/5/13/chartex" xmlns:cx8="http://schemas.microsoft.com/office/drawing/2016/5/14/chartex" xmlns:mc="http://schemas.openxmlformats.org/markup-compatibility/2006" xmlns:aink="http://schemas.microsoft.com/office/drawing/2016/ink" xmlns:am3d="http://schemas.microsoft.com/office/drawing/2017/model3d" xmlns:o="urn:schemas-microsoft-com:office:office" xmlns:oel="http://schemas.microsoft.com/office/2019/extlst" xmlns:r="http://schemas.openxmlformats.org/officeDocument/2006/relationships" xmlns:m="http://schemas.openxmlformats.org/officeDocument/2006/math" xmlns:v="urn:schemas-microsoft-com:vml" xmlns:wp14="http://schemas.microsoft.com/office/word/2010/wordprocessingDrawing" xmlns:wp="http://schemas.openxmlformats.org/drawingml/2006/wordprocessingDrawing" xmlns:w10="urn:schemas-microsoft-com:office:word" xmlns:w="http://schemas.openxmlformats.org/wordprocessingml/2006/main" xmlns:w14="http://schemas.microsoft.com/office/word/2010/wordml" xmlns:w15="http://schemas.microsoft.com/office/word/2012/wordml" xmlns:w16cex="http://schemas.microsoft.com/office/word/2018/wordml/cex" xmlns:w16cid="http://schemas.microsoft.com/office/word/2016/wordml/cid" xmlns:w16="http://schemas.microsoft.com/office/word/2018/wordml" xmlns:w16du="http://schemas.microsoft.com/office/word/2023/wordml/word16du" xmlns:w16sdtdh="http://schemas.microsoft.com/office/word/2020/wordml/sdtdatahash" xmlns:w16se="http://schemas.microsoft.com/office/word/2015/wordml/symex" xmlns:wpg="http://schemas.microsoft.com/office/word/2010/wordprocessingGroup" xmlns:wpi="http://schemas.microsoft.com/office/word/2010/wordprocessingInk" xmlns:wne="http://schemas.microsoft.com/office/word/2006/wordml" xmlns:wps="http://schemas.microsoft.com/office/word/2010/wordprocessingShape" mc:Ignorable="w14 w15 w16se w16cid w16 w16cex w16sdtdh w16du wp14">
+<w:hdr xmlns:wpc="http://schemas.microsoft.com/office/word/2010/wordprocessingCanvas" xmlns:cx="http://schemas.microsoft.com/office/drawing/2014/chartex" xmlns:cx1="http://schemas.microsoft.com/office/drawing/2015/9/8/chartex" xmlns:cx2="http://schemas.microsoft.com/office/drawing/2015/10/21/chartex" xmlns:cx3="http://schemas.microsoft.com/office/drawing/2016/5/9/chartex" xmlns:cx4="http://schemas.microsoft.com/office/drawing/2016/5/10/chartex" xmlns:cx5="http://schemas.microsoft.com/office/drawing/2016/5/11/chartex" xmlns:cx6="http://schemas.microsoft.com/office/drawing/2016/5/12/chartex" xmlns:cx7="http://schemas.microsoft.com/office/drawing/2016/5/13/chartex" xmlns:cx8="http://schemas.microsoft.com/office/drawing/2016/5/14/chartex" xmlns:mc="http://schemas.openxmlformats.org/markup-compatibility/2006" xmlns:aink="http://schemas.microsoft.com/office/drawing/2016/ink" xmlns:am3d="http://schemas.microsoft.com/office/drawing/2017/model3d" xmlns:o="urn:schemas-microsoft-com:office:office" xmlns:oel="http://schemas.microsoft.com/office/2019/extlst" xmlns:r="http://schemas.openxmlformats.org/officeDocument/2006/relationships" xmlns:m="http://schemas.openxmlformats.org/officeDocument/2006/math" xmlns:v="urn:schemas-microsoft-com:vml" xmlns:wp14="http://schemas.microsoft.com/office/word/2010/wordprocessingDrawing" xmlns:wp="http://schemas.openxmlformats.org/drawingml/2006/wordprocessingDrawing" xmlns:w10="urn:schemas-microsoft-com:office:word" xmlns:w="http://schemas.openxmlformats.org/wordprocessingml/2006/main" xmlns:w14="http://schemas.microsoft.com/office/word/2010/wordml" xmlns:w15="http://schemas.microsoft.com/office/word/2012/wordml" xmlns:w16cex="http://schemas.microsoft.com/office/word/2018/wordml/cex" xmlns:w16cid="http://schemas.microsoft.com/office/word/2016/wordml/cid" xmlns:w16="http://schemas.microsoft.com/office/word/2018/wordml" xmlns:w16du="http://schemas.microsoft.com/office/word/2023/wordml/word16du" xmlns:w16sdtdh="http://schemas.microsoft.com/office/word/2020/wordml/sdtdatahash" xmlns:w16sdtfl="http://schemas.microsoft.com/office/word/2024/wordml/sdtformatlock" xmlns:w16se="http://schemas.microsoft.com/office/word/2015/wordml/symex" xmlns:wpg="http://schemas.microsoft.com/office/word/2010/wordprocessingGroup" xmlns:wpi="http://schemas.microsoft.com/office/word/2010/wordprocessingInk" xmlns:wne="http://schemas.microsoft.com/office/word/2006/wordml" xmlns:wps="http://schemas.microsoft.com/office/word/2010/wordprocessingShape" mc:Ignorable="w14 w15 w16se w16cid w16 w16cex w16sdtdh w16sdtfl w16du wp14">
   <w:p>
     <w:pPr>
       <w:pStyle w:val="Header"/>
@@ -1506,7 +1669,7 @@
 </file>
 
 <file path=word/numbering.xml><?xml version="1.0" encoding="utf-8"?>
-<w:numbering xmlns:wpc="http://schemas.microsoft.com/office/word/2010/wordprocessingCanvas" xmlns:cx="http://schemas.microsoft.com/office/drawing/2014/chartex" xmlns:cx1="http://schemas.microsoft.com/office/drawing/2015/9/8/chartex" xmlns:cx2="http://schemas.microsoft.com/office/drawing/2015/10/21/chartex" xmlns:cx3="http://schemas.microsoft.com/office/drawing/2016/5/9/chartex" xmlns:cx4="http://schemas.microsoft.com/office/drawing/2016/5/10/chartex" xmlns:cx5="http://schemas.microsoft.com/office/drawing/2016/5/11/chartex" xmlns:cx6="http://schemas.microsoft.com/office/drawing/2016/5/12/chartex" xmlns:cx7="http://schemas.microsoft.com/office/drawing/2016/5/13/chartex" xmlns:cx8="http://schemas.microsoft.com/office/drawing/2016/5/14/chartex" xmlns:mc="http://schemas.openxmlformats.org/markup-compatibility/2006" xmlns:aink="http://schemas.microsoft.com/office/drawing/2016/ink" xmlns:am3d="http://schemas.microsoft.com/office/drawing/2017/model3d" xmlns:o="urn:schemas-microsoft-com:office:office" xmlns:oel="http://schemas.microsoft.com/office/2019/extlst" xmlns:r="http://schemas.openxmlformats.org/officeDocument/2006/relationships" xmlns:m="http://schemas.openxmlformats.org/officeDocument/2006/math" xmlns:v="urn:schemas-microsoft-com:vml" xmlns:wp14="http://schemas.microsoft.com/office/word/2010/wordprocessingDrawing" xmlns:wp="http://schemas.openxmlformats.org/drawingml/2006/wordprocessingDrawing" xmlns:w10="urn:schemas-microsoft-com:office:word" xmlns:w="http://schemas.openxmlformats.org/wordprocessingml/2006/main" xmlns:w14="http://schemas.microsoft.com/office/word/2010/wordml" xmlns:w15="http://schemas.microsoft.com/office/word/2012/wordml" xmlns:w16cex="http://schemas.microsoft.com/office/word/2018/wordml/cex" xmlns:w16cid="http://schemas.microsoft.com/office/word/2016/wordml/cid" xmlns:w16="http://schemas.microsoft.com/office/word/2018/wordml" xmlns:w16du="http://schemas.microsoft.com/office/word/2023/wordml/word16du" xmlns:w16sdtdh="http://schemas.microsoft.com/office/word/2020/wordml/sdtdatahash" xmlns:w16se="http://schemas.microsoft.com/office/word/2015/wordml/symex" xmlns:wpg="http://schemas.microsoft.com/office/word/2010/wordprocessingGroup" xmlns:wpi="http://schemas.microsoft.com/office/word/2010/wordprocessingInk" xmlns:wne="http://schemas.microsoft.com/office/word/2006/wordml" xmlns:wps="http://schemas.microsoft.com/office/word/2010/wordprocessingShape" mc:Ignorable="w14 w15 w16se w16cid w16 w16cex w16sdtdh w16du wp14">
+<w:numbering xmlns:wpc="http://schemas.microsoft.com/office/word/2010/wordprocessingCanvas" xmlns:cx="http://schemas.microsoft.com/office/drawing/2014/chartex" xmlns:cx1="http://schemas.microsoft.com/office/drawing/2015/9/8/chartex" xmlns:cx2="http://schemas.microsoft.com/office/drawing/2015/10/21/chartex" xmlns:cx3="http://schemas.microsoft.com/office/drawing/2016/5/9/chartex" xmlns:cx4="http://schemas.microsoft.com/office/drawing/2016/5/10/chartex" xmlns:cx5="http://schemas.microsoft.com/office/drawing/2016/5/11/chartex" xmlns:cx6="http://schemas.microsoft.com/office/drawing/2016/5/12/chartex" xmlns:cx7="http://schemas.microsoft.com/office/drawing/2016/5/13/chartex" xmlns:cx8="http://schemas.microsoft.com/office/drawing/2016/5/14/chartex" xmlns:mc="http://schemas.openxmlformats.org/markup-compatibility/2006" xmlns:aink="http://schemas.microsoft.com/office/drawing/2016/ink" xmlns:am3d="http://schemas.microsoft.com/office/drawing/2017/model3d" xmlns:o="urn:schemas-microsoft-com:office:office" xmlns:oel="http://schemas.microsoft.com/office/2019/extlst" xmlns:r="http://schemas.openxmlformats.org/officeDocument/2006/relationships" xmlns:m="http://schemas.openxmlformats.org/officeDocument/2006/math" xmlns:v="urn:schemas-microsoft-com:vml" xmlns:wp14="http://schemas.microsoft.com/office/word/2010/wordprocessingDrawing" xmlns:wp="http://schemas.openxmlformats.org/drawingml/2006/wordprocessingDrawing" xmlns:w10="urn:schemas-microsoft-com:office:word" xmlns:w="http://schemas.openxmlformats.org/wordprocessingml/2006/main" xmlns:w14="http://schemas.microsoft.com/office/word/2010/wordml" xmlns:w15="http://schemas.microsoft.com/office/word/2012/wordml" xmlns:w16cex="http://schemas.microsoft.com/office/word/2018/wordml/cex" xmlns:w16cid="http://schemas.microsoft.com/office/word/2016/wordml/cid" xmlns:w16="http://schemas.microsoft.com/office/word/2018/wordml" xmlns:w16du="http://schemas.microsoft.com/office/word/2023/wordml/word16du" xmlns:w16sdtdh="http://schemas.microsoft.com/office/word/2020/wordml/sdtdatahash" xmlns:w16sdtfl="http://schemas.microsoft.com/office/word/2024/wordml/sdtformatlock" xmlns:w16se="http://schemas.microsoft.com/office/word/2015/wordml/symex" xmlns:wpg="http://schemas.microsoft.com/office/word/2010/wordprocessingGroup" xmlns:wpi="http://schemas.microsoft.com/office/word/2010/wordprocessingInk" xmlns:wne="http://schemas.microsoft.com/office/word/2006/wordml" xmlns:wps="http://schemas.microsoft.com/office/word/2010/wordprocessingShape" mc:Ignorable="w14 w15 w16se w16cid w16 w16cex w16sdtdh w16sdtfl w16du wp14">
   <w:abstractNum w:abstractNumId="0" w15:restartNumberingAfterBreak="0">
     <w:nsid w:val="FFFFFF7C"/>
     <w:multiLevelType w:val="singleLevel"/>
@@ -4284,7 +4447,7 @@
 </file>
 
 <file path=word/styles.xml><?xml version="1.0" encoding="utf-8"?>
-<w:styles xmlns:mc="http://schemas.openxmlformats.org/markup-compatibility/2006" xmlns:r="http://schemas.openxmlformats.org/officeDocument/2006/relationships" xmlns:w="http://schemas.openxmlformats.org/wordprocessingml/2006/main" xmlns:w14="http://schemas.microsoft.com/office/word/2010/wordml" xmlns:w15="http://schemas.microsoft.com/office/word/2012/wordml" xmlns:w16cex="http://schemas.microsoft.com/office/word/2018/wordml/cex" xmlns:w16cid="http://schemas.microsoft.com/office/word/2016/wordml/cid" xmlns:w16="http://schemas.microsoft.com/office/word/2018/wordml" xmlns:w16du="http://schemas.microsoft.com/office/word/2023/wordml/word16du" xmlns:w16sdtdh="http://schemas.microsoft.com/office/word/2020/wordml/sdtdatahash" xmlns:w16se="http://schemas.microsoft.com/office/word/2015/wordml/symex" mc:Ignorable="w14 w15 w16se w16cid w16 w16cex w16sdtdh w16du">
+<w:styles xmlns:mc="http://schemas.openxmlformats.org/markup-compatibility/2006" xmlns:r="http://schemas.openxmlformats.org/officeDocument/2006/relationships" xmlns:w="http://schemas.openxmlformats.org/wordprocessingml/2006/main" xmlns:w14="http://schemas.microsoft.com/office/word/2010/wordml" xmlns:w15="http://schemas.microsoft.com/office/word/2012/wordml" xmlns:w16cex="http://schemas.microsoft.com/office/word/2018/wordml/cex" xmlns:w16cid="http://schemas.microsoft.com/office/word/2016/wordml/cid" xmlns:w16="http://schemas.microsoft.com/office/word/2018/wordml" xmlns:w16du="http://schemas.microsoft.com/office/word/2023/wordml/word16du" xmlns:w16sdtdh="http://schemas.microsoft.com/office/word/2020/wordml/sdtdatahash" xmlns:w16sdtfl="http://schemas.microsoft.com/office/word/2024/wordml/sdtformatlock" xmlns:w16se="http://schemas.microsoft.com/office/word/2015/wordml/symex" mc:Ignorable="w14 w15 w16se w16cid w16 w16cex w16sdtdh w16sdtfl w16du">
   <w:docDefaults>
     <w:rPrDefault>
       <w:rPr>
@@ -6172,10 +6335,21 @@
 </file>
 
 <file path=customXml/item1.xml><?xml version="1.0" encoding="utf-8"?>
-<b:Sources xmlns:b="http://schemas.openxmlformats.org/officeDocument/2006/bibliography" xmlns="http://schemas.openxmlformats.org/officeDocument/2006/bibliography" SelectedStyle="/APASixthEditionOfficeOnline.xsl" StyleName="APA"/>
+<?mso-contentType ?>
+<FormTemplates xmlns="http://schemas.microsoft.com/sharepoint/v3/contenttype/forms">
+  <Display>DocumentLibraryForm</Display>
+  <Edit>DocumentLibraryForm</Edit>
+  <New>DocumentLibraryForm</New>
+</FormTemplates>
 </file>
 
 <file path=customXml/item2.xml><?xml version="1.0" encoding="utf-8"?>
+<p:properties xmlns:p="http://schemas.microsoft.com/office/2006/metadata/properties" xmlns:xsi="http://www.w3.org/2001/XMLSchema-instance" xmlns:pc="http://schemas.microsoft.com/office/infopath/2007/PartnerControls">
+  <documentManagement/>
+</p:properties>
+</file>
+
+<file path=customXml/item3.xml><?xml version="1.0" encoding="utf-8"?>
 <ct:contentTypeSchema xmlns:ct="http://schemas.microsoft.com/office/2006/metadata/contentType" xmlns:ma="http://schemas.microsoft.com/office/2006/metadata/properties/metaAttributes" ct:_="" ma:_="" ma:contentTypeName="Document" ma:contentTypeID="0x01010090F2DB91459FFC41B93FC035E45A04CC" ma:contentTypeVersion="4" ma:contentTypeDescription="Create a new document." ma:contentTypeScope="" ma:versionID="81cbb3e2665cab4020ace0e96ff15c4c">
   <xsd:schema xmlns:xsd="http://www.w3.org/2001/XMLSchema" xmlns:xs="http://www.w3.org/2001/XMLSchema" xmlns:p="http://schemas.microsoft.com/office/2006/metadata/properties" xmlns:ns2="cfe8b6ae-0cb3-4d4b-8977-2740f2d4b09f" targetNamespace="http://schemas.microsoft.com/office/2006/metadata/properties" ma:root="true" ma:fieldsID="72a7489b83e04f2dbc91c4cb4eed6fec" ns2:_="">
     <xsd:import namespace="cfe8b6ae-0cb3-4d4b-8977-2740f2d4b09f"/>
@@ -6319,30 +6493,35 @@
 </ct:contentTypeSchema>
 </file>
 
-<file path=customXml/item3.xml><?xml version="1.0" encoding="utf-8"?>
-<p:properties xmlns:p="http://schemas.microsoft.com/office/2006/metadata/properties" xmlns:xsi="http://www.w3.org/2001/XMLSchema-instance" xmlns:pc="http://schemas.microsoft.com/office/infopath/2007/PartnerControls">
-  <documentManagement/>
-</p:properties>
-</file>
-
 <file path=customXml/item4.xml><?xml version="1.0" encoding="utf-8"?>
-<?mso-contentType ?>
-<FormTemplates xmlns="http://schemas.microsoft.com/sharepoint/v3/contenttype/forms">
-  <Display>DocumentLibraryForm</Display>
-  <Edit>DocumentLibraryForm</Edit>
-  <New>DocumentLibraryForm</New>
-</FormTemplates>
+<b:Sources xmlns:b="http://schemas.openxmlformats.org/officeDocument/2006/bibliography" xmlns="http://schemas.openxmlformats.org/officeDocument/2006/bibliography" SelectedStyle="/APASixthEditionOfficeOnline.xsl" StyleName="APA"/>
 </file>
 
 <file path=customXml/itemProps1.xml><?xml version="1.0" encoding="utf-8"?>
-<ds:datastoreItem xmlns:ds="http://schemas.openxmlformats.org/officeDocument/2006/customXml" ds:itemID="{A68DA67B-E741-479E-BDF8-B44F227CB738}">
+<ds:datastoreItem xmlns:ds="http://schemas.openxmlformats.org/officeDocument/2006/customXml" ds:itemID="{A61591CA-50F3-4536-AE67-15E345F833C7}">
   <ds:schemaRefs>
-    <ds:schemaRef ds:uri="http://schemas.openxmlformats.org/officeDocument/2006/bibliography"/>
+    <ds:schemaRef ds:uri="http://schemas.microsoft.com/sharepoint/v3/contenttype/forms"/>
   </ds:schemaRefs>
 </ds:datastoreItem>
 </file>
 
 <file path=customXml/itemProps2.xml><?xml version="1.0" encoding="utf-8"?>
+<ds:datastoreItem xmlns:ds="http://schemas.openxmlformats.org/officeDocument/2006/customXml" ds:itemID="{BB42FEB8-477B-4856-B54A-DEFEE3AB4638}">
+  <ds:schemaRefs>
+    <ds:schemaRef ds:uri="http://www.w3.org/XML/1998/namespace"/>
+    <ds:schemaRef ds:uri="http://purl.org/dc/dcmitype/"/>
+    <ds:schemaRef ds:uri="http://schemas.microsoft.com/office/infopath/2007/PartnerControls"/>
+    <ds:schemaRef ds:uri="http://purl.org/dc/elements/1.1/"/>
+    <ds:schemaRef ds:uri="http://schemas.microsoft.com/office/2006/metadata/properties"/>
+    <ds:schemaRef ds:uri="http://schemas.microsoft.com/office/2006/documentManagement/types"/>
+    <ds:schemaRef ds:uri="http://schemas.openxmlformats.org/package/2006/metadata/core-properties"/>
+    <ds:schemaRef ds:uri="cfe8b6ae-0cb3-4d4b-8977-2740f2d4b09f"/>
+    <ds:schemaRef ds:uri="http://purl.org/dc/terms/"/>
+  </ds:schemaRefs>
+</ds:datastoreItem>
+</file>
+
+<file path=customXml/itemProps3.xml><?xml version="1.0" encoding="utf-8"?>
 <ds:datastoreItem xmlns:ds="http://schemas.openxmlformats.org/officeDocument/2006/customXml" ds:itemID="{0E91AD81-D633-49EB-A2F5-7355A94847E2}">
   <ds:schemaRefs>
     <ds:schemaRef ds:uri="http://schemas.microsoft.com/office/2006/metadata/contentType"/>
@@ -6360,26 +6539,10 @@
 </ds:datastoreItem>
 </file>
 
-<file path=customXml/itemProps3.xml><?xml version="1.0" encoding="utf-8"?>
-<ds:datastoreItem xmlns:ds="http://schemas.openxmlformats.org/officeDocument/2006/customXml" ds:itemID="{BB42FEB8-477B-4856-B54A-DEFEE3AB4638}">
+<file path=customXml/itemProps4.xml><?xml version="1.0" encoding="utf-8"?>
+<ds:datastoreItem xmlns:ds="http://schemas.openxmlformats.org/officeDocument/2006/customXml" ds:itemID="{A68DA67B-E741-479E-BDF8-B44F227CB738}">
   <ds:schemaRefs>
-    <ds:schemaRef ds:uri="http://www.w3.org/XML/1998/namespace"/>
-    <ds:schemaRef ds:uri="http://purl.org/dc/dcmitype/"/>
-    <ds:schemaRef ds:uri="http://schemas.microsoft.com/office/infopath/2007/PartnerControls"/>
-    <ds:schemaRef ds:uri="http://purl.org/dc/elements/1.1/"/>
-    <ds:schemaRef ds:uri="http://schemas.microsoft.com/office/2006/metadata/properties"/>
-    <ds:schemaRef ds:uri="http://schemas.microsoft.com/office/2006/documentManagement/types"/>
-    <ds:schemaRef ds:uri="http://schemas.openxmlformats.org/package/2006/metadata/core-properties"/>
-    <ds:schemaRef ds:uri="cfe8b6ae-0cb3-4d4b-8977-2740f2d4b09f"/>
-    <ds:schemaRef ds:uri="http://purl.org/dc/terms/"/>
-  </ds:schemaRefs>
-</ds:datastoreItem>
-</file>
-
-<file path=customXml/itemProps4.xml><?xml version="1.0" encoding="utf-8"?>
-<ds:datastoreItem xmlns:ds="http://schemas.openxmlformats.org/officeDocument/2006/customXml" ds:itemID="{A61591CA-50F3-4536-AE67-15E345F833C7}">
-  <ds:schemaRefs>
-    <ds:schemaRef ds:uri="http://schemas.microsoft.com/sharepoint/v3/contenttype/forms"/>
+    <ds:schemaRef ds:uri="http://schemas.openxmlformats.org/officeDocument/2006/bibliography"/>
   </ds:schemaRefs>
 </ds:datastoreItem>
 </file>
</xml_diff>